<commit_message>
Update domain notes and interim report with mermaid diagram
</commit_message>
<xml_diff>
--- a/Interim_Report.docx
+++ b/Interim_Report.docx
@@ -26,36 +26,31 @@
     <w:p/>
     <w:p>
       <w:r>
-        <w:t>The component described (callbacks like LangChain traces) is Event-Driven Architecture, not Event Sourcing. It emits events for observability, but the events are not the system of record and cannot reconstruct state. If redesigned with The Ledger, each domain decision (and its inputs) would be appended to an immutable stream, and aggregates would rebuild state by replaying events. The gain is strong auditability, replayability, temporal queries, and deterministic reconstruction of how a decision was made.</w:t>
+        <w:t>Callback-based tracing (e.g., LangChain traces) is **EDA**, not ES: events are optional, can be dropped, and are not the system of record. **Event Sourcing** makes events the permanent record of truth; state is reconstructed by replay. Redesigning with The Ledger changes: (a) all decisions become immutable events in the events table, (b) aggregates rebuild state from streams, (c) projections provide queryable views. Gains: deterministic replay, auditability, and the ability for compliance to reconstruct state at any timestamp.</w:t>
       </w:r>
     </w:p>
     <w:p/>
     <w:p>
       <w:r>
-        <w:t>Chosen boundaries: LoanApplication, DocumentPackage, AgentSession, ComplianceRecord (per spec). Alternative boundary considered: collapsing AgentSession into LoanApplication. I rejected it because it couples agent operational telemetry to domain state and forces domain reads to scan large session histories. Separate AgentSession prevents cross-cutting concerns (cost, tool usage, retries) from bloating the core business aggregate.</w:t>
+        <w:t>Chosen boundaries: LoanApplication, DocumentPackage, AgentSession, ComplianceRecord. Alternative boundary rejected: **merge ComplianceRecord into LoanApplication**. That coupling would force every ComplianceRulePassed/Failed write to take a lock on the LoanApplication stream, creating write contention when multiple agents operate concurrently. It also creates a failure mode where a compliance retry blocks loan decisions. Separating ComplianceRecord isolates compliance write spikes and prevents cross‑aggregate contention.</w:t>
       </w:r>
     </w:p>
     <w:p/>
     <w:p>
       <w:r>
-        <w:t>Sequence: both agents read stream at v3; both call append with expected_version=3. The store locks stream row, checks current_version. One transaction wins, inserts events, updates current_version to 4. The losing transaction sees current_version=4 and receives OptimisticConcurrencyError. The losing agent must reload the stream, reconcile the new state, and decide whether to retry or abort.</w:t>
+        <w:t>Sequence: both agents read stream at v3 → both call append with expected_version=3 → first writer acquires the stream lock / passes the version check and commits, advancing current_version to 4 → second writer fails the version check → losing agent receives OptimisticConcurrencyError(stream_id, expected=3, actual=4) → losing agent reloads the stream, inspects the new event, and decides whether to retry or abandon.</w:t>
       </w:r>
     </w:p>
     <w:p/>
     <w:p>
       <w:r>
-        <w:t>With 200ms lag, a loan officer may see a stale limit just after a disbursement event. The system should surface a freshness indicator in the UI and, for critical actions, re-check the write model or wait until the projection catches up. UX should communicate: "State may be up to 200ms behind. Refreshing..." and disable unsafe actions until the projection is current.</w:t>
+        <w:t>With 200ms lag, a loan officer may see a stale limit immediately after a disbursement. The system responds by **displaying a lag indicator** (last_event_at timestamp) and, for critical actions, performing a **strong-consistency fallback** (re-read from stream or block until checkpoint catches up). The UI contract states: “Projections may be ~200ms behind; refreshing…” and treats this as an accepted trade‑off, not an error.</w:t>
       </w:r>
     </w:p>
     <w:p/>
     <w:p>
       <w:r>
-        <w:t>Upcaster from v1 to v2 adds model_version, confidence_score, regulatory_basis.</w:t>
-      </w:r>
-    </w:p>
-    <w:p>
-      <w:r>
-        <w:t>Strategy: infer defaults for historical events: model_version="unknown", confidence_score=None (or 0.0 if required by schema), regulatory_basis=["legacy"]. Keep original reason and decision unchanged. Example pseudo-code:</w:t>
+        <w:t>Upcaster v1→v2 adds model_version, confidence_score, regulatory_basis. Strategy: **confidence_score remains null** because fabricating a score would corrupt analytics and regulatory records; null correctly signals “unknown.” **model_version** is inferred from recorded_at against a known deployment timeline and flagged as approximate. **regulatory_basis** is inferred from the rule versions active at recorded_at.</w:t>
       </w:r>
     </w:p>
     <w:p/>
@@ -66,27 +61,47 @@
     </w:p>
     <w:p>
       <w:r>
-        <w:t>if event_version == 1:</w:t>
+        <w:t>def upcast_v1_to_v2(event):</w:t>
       </w:r>
     </w:p>
     <w:p>
       <w:r>
-        <w:t xml:space="preserve">    payload["model_version"] = "unknown"</w:t>
+        <w:t xml:space="preserve">    ts = event["recorded_at"]</w:t>
       </w:r>
     </w:p>
     <w:p>
       <w:r>
-        <w:t xml:space="preserve">    payload["confidence_score"] = payload.get("confidence_score")  # None</w:t>
+        <w:t xml:space="preserve">    payload = dict(event["payload"])</w:t>
       </w:r>
     </w:p>
     <w:p>
       <w:r>
-        <w:t xml:space="preserve">    payload["regulatory_basis"] = payload.get("regulatory_basis") or ["legacy"]</w:t>
+        <w:t xml:space="preserve">    payload["confidence_score"] = None</w:t>
       </w:r>
     </w:p>
     <w:p>
       <w:r>
-        <w:t xml:space="preserve">    event_version = 2</w:t>
+        <w:t xml:space="preserve">    payload["model_version"] = "legacy-pre-2026" if ts &lt; "2026-01-01" else "legacy-2026"</w:t>
+      </w:r>
+    </w:p>
+    <w:p>
+      <w:r>
+        <w:t xml:space="preserve">    payload["regulatory_basis"] = ["2025-Q4"] if ts &lt; "2026-01-01" else ["2026-Q1"]</w:t>
+      </w:r>
+    </w:p>
+    <w:p>
+      <w:r>
+        <w:t xml:space="preserve">    event["payload"] = payload</w:t>
+      </w:r>
+    </w:p>
+    <w:p>
+      <w:r>
+        <w:t xml:space="preserve">    event["event_version"] = 2</w:t>
+      </w:r>
+    </w:p>
+    <w:p>
+      <w:r>
+        <w:t xml:space="preserve">    return event</w:t>
       </w:r>
     </w:p>
     <w:p>
@@ -97,7 +112,7 @@
     <w:p/>
     <w:p>
       <w:r>
-        <w:t>To distribute projections, run multiple daemon workers with a shared coordination primitive (Postgres advisory locks or a lease table). Each worker claims a projection shard or event range. The lock prevents two workers from processing the same projection events. This guards against duplicate projection writes and race conditions when checkpoints advance.</w:t>
+        <w:t>To distribute projections, run multiple daemon workers with a **lease table or Postgres advisory locks**. Workers claim a projection or event‑range lease; this prevents two workers from processing the same batch (duplicate writes corrupt aggregated metrics). If the leader crashes, the lease expires and a follower resumes from the last checkpoint. This guards against double‑processing and lost checkpoints.</w:t>
       </w:r>
     </w:p>
     <w:p>
@@ -110,12 +125,97 @@
         <w:pStyle w:val="Heading2"/>
       </w:pPr>
       <w:r>
-        <w:t>2. Architecture Diagram</w:t>
+        <w:t>2. Architecture Diagram (Mermaid Source)</w:t>
       </w:r>
     </w:p>
     <w:p>
       <w:r>
-        <w:t>Diagram included in PDF version: Interim_Report.pdf</w:t>
+        <w:t>flowchart LR</w:t>
+      </w:r>
+    </w:p>
+    <w:p>
+      <w:r>
+        <w:t xml:space="preserve">  A[Command] --&gt; B[Command Handler]</w:t>
+      </w:r>
+    </w:p>
+    <w:p>
+      <w:r>
+        <w:t xml:space="preserve">  B --&gt; C[Aggregate Rebuild</w:t>
+      </w:r>
+    </w:p>
+    <w:p>
+      <w:r>
+        <w:t>(load stream)]</w:t>
+      </w:r>
+    </w:p>
+    <w:p>
+      <w:r>
+        <w:t xml:space="preserve">  C --&gt; D[Validate Guards]</w:t>
+      </w:r>
+    </w:p>
+    <w:p>
+      <w:r>
+        <w:t xml:space="preserve">  D --&gt; E[Append Events]</w:t>
+      </w:r>
+    </w:p>
+    <w:p>
+      <w:r>
+        <w:t xml:space="preserve">  E --&gt; F[(events table)]</w:t>
+      </w:r>
+    </w:p>
+    <w:p>
+      <w:r>
+        <w:t xml:space="preserve">  E --&gt; G[(outbox)]</w:t>
+      </w:r>
+    </w:p>
+    <w:p>
+      <w:r>
+        <w:t xml:space="preserve">  F --&gt; H[Projections]</w:t>
+      </w:r>
+    </w:p>
+    <w:p>
+      <w:r>
+        <w:t xml:space="preserve">  H --&gt; I[Resources/Queries]</w:t>
+      </w:r>
+    </w:p>
+    <w:p>
+      <w:r>
+        <w:t xml:space="preserve">  subgraph Streams</w:t>
+      </w:r>
+    </w:p>
+    <w:p>
+      <w:r>
+        <w:t xml:space="preserve">    L[loan-{id}]</w:t>
+      </w:r>
+    </w:p>
+    <w:p>
+      <w:r>
+        <w:t xml:space="preserve">    D1[docpkg-{id}]</w:t>
+      </w:r>
+    </w:p>
+    <w:p>
+      <w:r>
+        <w:t xml:space="preserve">    A1[agent-{type}-{session_id}]</w:t>
+      </w:r>
+    </w:p>
+    <w:p>
+      <w:r>
+        <w:t xml:space="preserve">    C1[credit-{id}]</w:t>
+      </w:r>
+    </w:p>
+    <w:p>
+      <w:r>
+        <w:t xml:space="preserve">    F1[fraud-{id}]</w:t>
+      </w:r>
+    </w:p>
+    <w:p>
+      <w:r>
+        <w:t xml:space="preserve">    C2[compliance-{id}]</w:t>
+      </w:r>
+    </w:p>
+    <w:p>
+      <w:r>
+        <w:t xml:space="preserve">  end</w:t>
       </w:r>
     </w:p>
     <w:p>
@@ -229,6 +329,30 @@
     <w:p>
       <w:r>
         <w:t>============================== 1 passed in 1.55s =============================</w:t>
+      </w:r>
+    </w:p>
+    <w:p>
+      <w:pPr>
+        <w:pStyle w:val="ListBullet"/>
+      </w:pPr>
+      <w:r>
+        <w:t>Assert total stream length = 4 after concurrent append</w:t>
+      </w:r>
+    </w:p>
+    <w:p>
+      <w:pPr>
+        <w:pStyle w:val="ListBullet"/>
+      </w:pPr>
+      <w:r>
+        <w:t>Assert winning event has stream_position = 4</w:t>
+      </w:r>
+    </w:p>
+    <w:p>
+      <w:pPr>
+        <w:pStyle w:val="ListBullet"/>
+      </w:pPr>
+      <w:r>
+        <w:t>Assert losing task raises OptimisticConcurrencyError</w:t>
       </w:r>
     </w:p>
     <w:p>

</xml_diff>

<commit_message>
Expand interim report progress, gaps, and plan
</commit_message>
<xml_diff>
--- a/Interim_Report.docx
+++ b/Interim_Report.docx
@@ -236,7 +236,7 @@
         <w:pStyle w:val="ListBullet"/>
       </w:pPr>
       <w:r>
-        <w:t>Phase 1: EventStore schema + OCC + tests (PASS)</w:t>
+        <w:t>Phase 1: EventStore schema + OCC + tests (PASS) ? events/event_streams/outbox/checkpoints in place, OCC enforced with SELECT FOR UPDATE, append writes events + outbox in one transaction.</w:t>
       </w:r>
     </w:p>
     <w:p>
@@ -244,7 +244,7 @@
         <w:pStyle w:val="ListBullet"/>
       </w:pPr>
       <w:r>
-        <w:t>Phase 2: Aggregates, domain rules, handlers (PASS)</w:t>
+        <w:t>Phase 2: Aggregates, domain rules, handlers (PASS) ? LoanApplication + AgentSession aggregates replay streams, guard methods enforce rules; handlers follow load?validate?determine?append.</w:t>
       </w:r>
     </w:p>
     <w:p>
@@ -252,7 +252,7 @@
         <w:pStyle w:val="ListBullet"/>
       </w:pPr>
       <w:r>
-        <w:t>Phase 3: Projections + daemon + lag checks (PASS)</w:t>
+        <w:t>Phase 3: Projections + daemon + lag checks (PASS) ? ApplicationSummary, AgentPerformanceLedger, ComplianceAuditView with temporal queries; ProjectionDaemon handles retries + lag tracking.</w:t>
       </w:r>
     </w:p>
     <w:p>
@@ -260,7 +260,7 @@
         <w:pStyle w:val="ListBullet"/>
       </w:pPr>
       <w:r>
-        <w:t>Phase 4: Upcasting, integrity chain, Gas Town memory (PASS)</w:t>
+        <w:t>Phase 4: Upcasting, integrity chain, Gas Town memory (PASS) ? UpcasterRegistry on read, immutability test passing, audit hash chain, session reconstruction with NEEDS_RECONCILIATION.</w:t>
       </w:r>
     </w:p>
     <w:p>
@@ -268,7 +268,7 @@
         <w:pStyle w:val="ListBullet"/>
       </w:pPr>
       <w:r>
-        <w:t>Phase 5: MCP server tools/resources implemented</w:t>
+        <w:t>Phase 5: MCP server tools/resources implemented ? 8 tools + 6 resources with structured errors and preconditions. Integration run pending.</w:t>
       </w:r>
     </w:p>
     <w:p>
@@ -336,7 +336,7 @@
         <w:pStyle w:val="ListBullet"/>
       </w:pPr>
       <w:r>
-        <w:t>Assert total stream length = 4 after concurrent append</w:t>
+        <w:t>Assert total stream length = 4 after concurrent append (exactly one event added).</w:t>
       </w:r>
     </w:p>
     <w:p>
@@ -344,7 +344,7 @@
         <w:pStyle w:val="ListBullet"/>
       </w:pPr>
       <w:r>
-        <w:t>Assert winning event has stream_position = 4</w:t>
+        <w:t>Assert winning event has stream_position = 4 (deterministic stream ordering).</w:t>
       </w:r>
     </w:p>
     <w:p>
@@ -352,7 +352,7 @@
         <w:pStyle w:val="ListBullet"/>
       </w:pPr>
       <w:r>
-        <w:t>Assert losing task raises OptimisticConcurrencyError</w:t>
+        <w:t>Assert losing task raises OptimisticConcurrencyError with expected=3, actual=4.</w:t>
       </w:r>
     </w:p>
     <w:p>
@@ -368,7 +368,7 @@
         <w:pStyle w:val="ListBullet"/>
       </w:pPr>
       <w:r>
-        <w:t>Run full MCP integration scenario and capture output</w:t>
+        <w:t>MCP integration run not yet executed; need to drive full lifecycle via MCP tools and capture outputs.</w:t>
       </w:r>
     </w:p>
     <w:p>
@@ -376,7 +376,7 @@
         <w:pStyle w:val="ListBullet"/>
       </w:pPr>
       <w:r>
-        <w:t>Generate uv.lock locally and commit</w:t>
+        <w:t>uv.lock generation blocked by network in this environment; must run locally with internet access.</w:t>
       </w:r>
     </w:p>
     <w:p>
@@ -392,7 +392,7 @@
         <w:pStyle w:val="ListBullet"/>
       </w:pPr>
       <w:r>
-        <w:t>Run MCP integration flow: submit_application ? credit ? fraud ? compliance ? decision ? human review</w:t>
+        <w:t>Run MCP integration: submit_application ? record_credit_analysis ? record_fraud_screening ? record_compliance_check ? generate_decision ? record_human_review.</w:t>
       </w:r>
     </w:p>
     <w:p>
@@ -400,7 +400,7 @@
         <w:pStyle w:val="ListBullet"/>
       </w:pPr>
       <w:r>
-        <w:t>Capture MCP resource queries for audit/compliance views</w:t>
+        <w:t>Query MCP resources: application summary + compliance audit view + audit trail to verify projections and traceability.</w:t>
       </w:r>
     </w:p>
     <w:p>
@@ -408,7 +408,7 @@
         <w:pStyle w:val="ListBullet"/>
       </w:pPr>
       <w:r>
-        <w:t>Generate uv.lock using local network access</w:t>
+        <w:t>Generate uv.lock locally (uv lock) and commit.</w:t>
       </w:r>
     </w:p>
     <w:sectPr>

</xml_diff>